<commit_message>
Strengthen pilot-sample-only framing: README banner + prominent notice added to all four docs (IRB, regulatory, architecture, validation)
</commit_message>
<xml_diff>
--- a/docs/Architecture_Design_Document.docx
+++ b/docs/Architecture_Design_Document.docx
@@ -44,6 +44,21 @@
           <w:szCs w:val="20"/>
         </w:rPr>
         <w:t xml:space="preserve">Author: Anas Shawah'en | Status: Pre-implementation design — no production code exists yet</w:t>
+      </w:r>
+    </w:p>
+    <w:p>
+      <w:pPr>
+        <w:spacing w:before="240" w:after="240"/>
+        <w:jc w:val="center"/>
+        <w:shd w:val="clear" w:color="auto" w:fill="FCE4D6"/>
+      </w:pPr>
+      <w:r>
+        <w:rPr>
+          <w:b/>
+          <w:color w:val="9C0006"/>
+          <w:sz w:val="20"/>
+        </w:rPr>
+        <w:t>PILOT SAMPLE ONLY — NOT A CLINICAL STUDY. This document describes a methodological pilot sample used to demonstrate technical and analytical readiness. No real patient data has been used, collected, or accessed. Nothing in this document authorizes real-world clinical use.</w:t>
       </w:r>
     </w:p>
     <w:p>

</xml_diff>